<commit_message>
Docs: replace LUNE/Green with STILL in resumes and cover letter
Co-Authored-By: Claude Opus 5.5 <noreply@anthropic.com>
</commit_message>
<xml_diff>
--- a/assets/docs/funnelmance-cover-letter.docx
+++ b/assets/docs/funnelmance-cover-letter.docx
@@ -633,7 +633,7 @@
                 <w:szCs w:val="16"/>
                 <w:lang w:eastAsia="ko-KR"/>
               </w:rPr>
-              <w:t xml:space="preserve">가상 향수 브랜드 ‘뤼느’ 프로젝트에서 브랜드의 핵심 이미지와 소비자에게 전달할 메시지를 먼저 정하고, 이를 48초 영상과 음악으로 구현했습니다.</w:t>
+              <w:t xml:space="preserve">가상 향수 브랜드 ‘뤼느’ 프로젝트에서 브랜드의 핵심 이미지와 소비자에게 전달할 메시지를 먼저 정하고, 이를 45초 영상과 음악으로 구현했습니다.</w:t>
             </w:r>
           </w:p>
           <w:p>
@@ -1085,7 +1085,7 @@
                 <w:szCs w:val="16"/>
                 <w:lang w:eastAsia="ko-KR"/>
               </w:rPr>
-              <w:t xml:space="preserve">제가 가진 근거는 뤼느의 브랜드 영상 기획과 편집, 40초 안에 문제와 해결을 전달한 공모전 영상 구성, 그리고 생성형 AI로 시안을 빠르게 만드는 경험입니다. 실제 광고 집행이나 A/B 테스트 경험은 아직 없기에, 그 부분은 입사 후 가장 먼저 배워야 할 영역이라고 생각합니다.</w:t>
+              <w:t xml:space="preserve">제가 가진 근거는 뤼느의 브랜드 영상 기획과 편집, 헤드폰을 쓰기 전과 후를 컷 리듬과 사운드로 대비시킨 STILL 헤드폰 광고, 그리고 생성형 AI로 시안을 빠르게 만드는 경험입니다. 실제 광고 집행이나 A/B 테스트 경험은 아직 없기에, 그 부분은 입사 후 가장 먼저 배워야 할 영역이라고 생각합니다.</w:t>
             </w:r>
           </w:p>
           <w:p>

</xml_diff>